<commit_message>
wrote more in the documentation about the design and colors
</commit_message>
<xml_diff>
--- a/docs/Documentation.docx
+++ b/docs/Documentation.docx
@@ -59,7 +59,9 @@
               <w:tab w:val="right" w:leader="dot" w:pos="9062"/>
             </w:tabs>
             <w:rPr>
+              <w:rFonts w:eastAsiaTheme="minorEastAsia"/>
               <w:noProof/>
+              <w:lang w:eastAsia="nb-NO"/>
             </w:rPr>
           </w:pPr>
           <w:r>
@@ -71,11 +73,154 @@
           <w:r>
             <w:fldChar w:fldCharType="separate"/>
           </w:r>
-          <w:hyperlink w:anchor="_Toc239152835" w:history="1">
+          <w:hyperlink w:anchor="_Toc239229029" w:history="1">
             <w:r>
               <w:rPr>
                 <w:rStyle w:val="Hyperkobling"/>
                 <w:noProof/>
+                <w:lang w:val="en-US"/>
+              </w:rPr>
+              <w:t>Description:</w:t>
+            </w:r>
+            <w:r>
+              <w:rPr>
+                <w:noProof/>
+                <w:webHidden/>
+              </w:rPr>
+              <w:tab/>
+            </w:r>
+            <w:r>
+              <w:rPr>
+                <w:noProof/>
+                <w:webHidden/>
+              </w:rPr>
+              <w:fldChar w:fldCharType="begin"/>
+            </w:r>
+            <w:r>
+              <w:rPr>
+                <w:noProof/>
+                <w:webHidden/>
+              </w:rPr>
+              <w:instrText xml:space="preserve"> PAGEREF _Toc239229029 \h </w:instrText>
+            </w:r>
+            <w:r>
+              <w:rPr>
+                <w:noProof/>
+                <w:webHidden/>
+              </w:rPr>
+            </w:r>
+            <w:r>
+              <w:rPr>
+                <w:noProof/>
+                <w:webHidden/>
+              </w:rPr>
+              <w:fldChar w:fldCharType="separate"/>
+            </w:r>
+            <w:r>
+              <w:rPr>
+                <w:noProof/>
+                <w:webHidden/>
+              </w:rPr>
+              <w:t>1</w:t>
+            </w:r>
+            <w:r>
+              <w:rPr>
+                <w:noProof/>
+                <w:webHidden/>
+              </w:rPr>
+              <w:fldChar w:fldCharType="end"/>
+            </w:r>
+          </w:hyperlink>
+        </w:p>
+        <w:p>
+          <w:pPr>
+            <w:pStyle w:val="INNH2"/>
+            <w:tabs>
+              <w:tab w:val="right" w:leader="dot" w:pos="9062"/>
+            </w:tabs>
+            <w:rPr>
+              <w:rFonts w:eastAsiaTheme="minorEastAsia"/>
+              <w:noProof/>
+              <w:lang w:eastAsia="nb-NO"/>
+            </w:rPr>
+          </w:pPr>
+          <w:hyperlink w:anchor="_Toc239229030" w:history="1">
+            <w:r>
+              <w:rPr>
+                <w:rStyle w:val="Hyperkobling"/>
+                <w:noProof/>
+                <w:lang w:val="en-US"/>
+              </w:rPr>
+              <w:t>Target audience:</w:t>
+            </w:r>
+            <w:r>
+              <w:rPr>
+                <w:noProof/>
+                <w:webHidden/>
+              </w:rPr>
+              <w:tab/>
+            </w:r>
+            <w:r>
+              <w:rPr>
+                <w:noProof/>
+                <w:webHidden/>
+              </w:rPr>
+              <w:fldChar w:fldCharType="begin"/>
+            </w:r>
+            <w:r>
+              <w:rPr>
+                <w:noProof/>
+                <w:webHidden/>
+              </w:rPr>
+              <w:instrText xml:space="preserve"> PAGEREF _Toc239229030 \h </w:instrText>
+            </w:r>
+            <w:r>
+              <w:rPr>
+                <w:noProof/>
+                <w:webHidden/>
+              </w:rPr>
+            </w:r>
+            <w:r>
+              <w:rPr>
+                <w:noProof/>
+                <w:webHidden/>
+              </w:rPr>
+              <w:fldChar w:fldCharType="separate"/>
+            </w:r>
+            <w:r>
+              <w:rPr>
+                <w:noProof/>
+                <w:webHidden/>
+              </w:rPr>
+              <w:t>1</w:t>
+            </w:r>
+            <w:r>
+              <w:rPr>
+                <w:noProof/>
+                <w:webHidden/>
+              </w:rPr>
+              <w:fldChar w:fldCharType="end"/>
+            </w:r>
+          </w:hyperlink>
+        </w:p>
+        <w:p>
+          <w:pPr>
+            <w:pStyle w:val="INNH2"/>
+            <w:tabs>
+              <w:tab w:val="right" w:leader="dot" w:pos="9062"/>
+            </w:tabs>
+            <w:rPr>
+              <w:rFonts w:eastAsiaTheme="minorEastAsia"/>
+              <w:noProof/>
+              <w:lang w:eastAsia="nb-NO"/>
+            </w:rPr>
+          </w:pPr>
+          <w:hyperlink w:anchor="_Toc239229031" w:history="1">
+            <w:r>
+              <w:rPr>
+                <w:rStyle w:val="Hyperkobling"/>
+                <w:noProof/>
+                <w:lang w:val="en-US"/>
               </w:rPr>
               <w:t>WireFrames:</w:t>
             </w:r>
@@ -98,7 +243,78 @@
                 <w:noProof/>
                 <w:webHidden/>
               </w:rPr>
-              <w:instrText xml:space="preserve"> PAGEREF _Toc239152835 \h </w:instrText>
+              <w:instrText xml:space="preserve"> PAGEREF _Toc239229031 \h </w:instrText>
+            </w:r>
+            <w:r>
+              <w:rPr>
+                <w:noProof/>
+                <w:webHidden/>
+              </w:rPr>
+            </w:r>
+            <w:r>
+              <w:rPr>
+                <w:noProof/>
+                <w:webHidden/>
+              </w:rPr>
+              <w:fldChar w:fldCharType="separate"/>
+            </w:r>
+            <w:r>
+              <w:rPr>
+                <w:noProof/>
+                <w:webHidden/>
+              </w:rPr>
+              <w:t>1</w:t>
+            </w:r>
+            <w:r>
+              <w:rPr>
+                <w:noProof/>
+                <w:webHidden/>
+              </w:rPr>
+              <w:fldChar w:fldCharType="end"/>
+            </w:r>
+          </w:hyperlink>
+        </w:p>
+        <w:p>
+          <w:pPr>
+            <w:pStyle w:val="INNH2"/>
+            <w:tabs>
+              <w:tab w:val="right" w:leader="dot" w:pos="9062"/>
+            </w:tabs>
+            <w:rPr>
+              <w:rFonts w:eastAsiaTheme="minorEastAsia"/>
+              <w:noProof/>
+              <w:lang w:eastAsia="nb-NO"/>
+            </w:rPr>
+          </w:pPr>
+          <w:hyperlink w:anchor="_Toc239229032" w:history="1">
+            <w:r>
+              <w:rPr>
+                <w:rStyle w:val="Hyperkobling"/>
+                <w:noProof/>
+                <w:lang w:val="en-US"/>
+              </w:rPr>
+              <w:t>Technologies:</w:t>
+            </w:r>
+            <w:r>
+              <w:rPr>
+                <w:noProof/>
+                <w:webHidden/>
+              </w:rPr>
+              <w:tab/>
+            </w:r>
+            <w:r>
+              <w:rPr>
+                <w:noProof/>
+                <w:webHidden/>
+              </w:rPr>
+              <w:fldChar w:fldCharType="begin"/>
+            </w:r>
+            <w:r>
+              <w:rPr>
+                <w:noProof/>
+                <w:webHidden/>
+              </w:rPr>
+              <w:instrText xml:space="preserve"> PAGEREF _Toc239229032 \h </w:instrText>
             </w:r>
             <w:r>
               <w:rPr>
@@ -154,74 +370,12 @@
           <w:lang w:val="en-US"/>
         </w:rPr>
       </w:pPr>
+      <w:bookmarkStart w:id="0" w:name="_Toc239229029"/>
       <w:r>
         <w:rPr>
           <w:lang w:val="en-US"/>
         </w:rPr>
         <w:t>Description:</w:t>
-      </w:r>
-    </w:p>
-    <w:p>
-      <w:pPr>
-        <w:rPr>
-          <w:lang w:val="en-US"/>
-        </w:rPr>
-      </w:pPr>
-      <w:r>
-        <w:rPr>
-          <w:lang w:val="en-US"/>
-        </w:rPr>
-        <w:t>I want to create a website that will serve as my résumé and portfolio. The purpose of the site is to showcase my skills, abilities, experience, and personality to potential employers and clients.</w:t>
-      </w:r>
-    </w:p>
-    <w:p>
-      <w:pPr>
-        <w:pStyle w:val="Overskrift2"/>
-        <w:rPr>
-          <w:lang w:val="en-US"/>
-        </w:rPr>
-      </w:pPr>
-      <w:r>
-        <w:rPr>
-          <w:lang w:val="en-US"/>
-        </w:rPr>
-        <w:t>Target audience:</w:t>
-      </w:r>
-    </w:p>
-    <w:p>
-      <w:pPr>
-        <w:rPr>
-          <w:lang w:val="en-US"/>
-        </w:rPr>
-      </w:pPr>
-      <w:r>
-        <w:rPr>
-          <w:lang w:val="en-US"/>
-        </w:rPr>
-        <w:t>The primary target audience is potential employers and people or organizations who may need my skills and services.</w:t>
-      </w:r>
-    </w:p>
-    <w:p>
-      <w:pPr>
-        <w:pStyle w:val="Overskrift2"/>
-        <w:rPr>
-          <w:lang w:val="en-US"/>
-        </w:rPr>
-      </w:pPr>
-      <w:bookmarkStart w:id="0" w:name="_Toc239152835"/>
-      <w:proofErr w:type="spellStart"/>
-      <w:r>
-        <w:rPr>
-          <w:lang w:val="en-US"/>
-        </w:rPr>
-        <w:t>WireFrames</w:t>
-      </w:r>
-      <w:proofErr w:type="spellEnd"/>
-      <w:r>
-        <w:rPr>
-          <w:lang w:val="en-US"/>
-        </w:rPr>
-        <w:t>:</w:t>
       </w:r>
       <w:bookmarkEnd w:id="0"/>
     </w:p>
@@ -235,7 +389,7 @@
         <w:rPr>
           <w:lang w:val="en-US"/>
         </w:rPr>
-        <w:t>The wireframes were created in Figma and provide a basic sketch of how the website may look and function. Designs were created for desktop, tablet, and mobile screen sizes.</w:t>
+        <w:t>I want to create a website that will serve as my résumé and portfolio. The purpose of the site is to showcase my skills, abilities, experience, and personality to potential employers and clients.</w:t>
       </w:r>
     </w:p>
     <w:p>
@@ -245,12 +399,14 @@
           <w:lang w:val="en-US"/>
         </w:rPr>
       </w:pPr>
-      <w:r>
-        <w:rPr>
-          <w:lang w:val="en-US"/>
-        </w:rPr>
-        <w:t>Technologies:</w:t>
-      </w:r>
+      <w:bookmarkStart w:id="1" w:name="_Toc239229030"/>
+      <w:r>
+        <w:rPr>
+          <w:lang w:val="en-US"/>
+        </w:rPr>
+        <w:t>Target audience:</w:t>
+      </w:r>
+      <w:bookmarkEnd w:id="1"/>
     </w:p>
     <w:p>
       <w:pPr>
@@ -262,21 +418,36 @@
         <w:rPr>
           <w:lang w:val="en-US"/>
         </w:rPr>
-        <w:t>ASP.Net MVC Core</w:t>
+        <w:t>The primary target audience is potential employers and people or organizations who may need my skills and services.</w:t>
       </w:r>
     </w:p>
     <w:p>
       <w:pPr>
-        <w:rPr>
-          <w:lang w:val="en-US"/>
-        </w:rPr>
-      </w:pPr>
-      <w:r>
-        <w:rPr>
-          <w:lang w:val="en-US"/>
-        </w:rPr>
-        <w:t>Figma</w:t>
-      </w:r>
+        <w:pStyle w:val="Overskrift2"/>
+        <w:rPr>
+          <w:lang w:val="en-US"/>
+        </w:rPr>
+      </w:pPr>
+      <w:bookmarkStart w:id="2" w:name="_Toc239229031"/>
+      <w:r>
+        <w:rPr>
+          <w:lang w:val="en-US"/>
+        </w:rPr>
+        <w:t>Wire</w:t>
+      </w:r>
+      <w:r>
+        <w:rPr>
+          <w:lang w:val="en-US"/>
+        </w:rPr>
+        <w:t xml:space="preserve"> </w:t>
+      </w:r>
+      <w:r>
+        <w:rPr>
+          <w:lang w:val="en-US"/>
+        </w:rPr>
+        <w:t>Frames:</w:t>
+      </w:r>
+      <w:bookmarkEnd w:id="2"/>
     </w:p>
     <w:p>
       <w:pPr>
@@ -288,11 +459,390 @@
         <w:rPr>
           <w:lang w:val="en-US"/>
         </w:rPr>
+        <w:t>The wireframes were created in Figma and provide a basic sketch of how the website may look and function. Designs were created for desktop, tablet, and mobile screen sizes.</w:t>
+      </w:r>
+    </w:p>
+    <w:p>
+      <w:pPr>
+        <w:pStyle w:val="Overskrift2"/>
+        <w:rPr>
+          <w:lang w:val="en-US"/>
+        </w:rPr>
+      </w:pPr>
+      <w:r>
+        <w:rPr>
+          <w:lang w:val="en-US"/>
+        </w:rPr>
+        <w:t>Design Plan:</w:t>
+      </w:r>
+    </w:p>
+    <w:p>
+      <w:pPr>
+        <w:rPr>
+          <w:lang w:val="en-US"/>
+        </w:rPr>
+      </w:pPr>
+      <w:r>
+        <w:rPr>
+          <w:lang w:val="en-US"/>
+        </w:rPr>
+        <w:t xml:space="preserve">I made a page in Figma to show the design il be using </w:t>
+      </w:r>
+      <w:r>
+        <w:rPr>
+          <w:lang w:val="en-US"/>
+        </w:rPr>
+        <w:t>on</w:t>
+      </w:r>
+      <w:r>
+        <w:rPr>
+          <w:lang w:val="en-US"/>
+        </w:rPr>
+        <w:t xml:space="preserve"> the site. Like the 5 </w:t>
+      </w:r>
+      <w:r>
+        <w:rPr>
+          <w:lang w:val="en-US"/>
+        </w:rPr>
+        <w:t>colors</w:t>
+      </w:r>
+      <w:r>
+        <w:rPr>
+          <w:lang w:val="en-US"/>
+        </w:rPr>
+        <w:t>, Font</w:t>
+      </w:r>
+      <w:r>
+        <w:rPr>
+          <w:lang w:val="en-US"/>
+        </w:rPr>
+        <w:t xml:space="preserve"> and icons. I struggled a bit </w:t>
+      </w:r>
+      <w:r>
+        <w:rPr>
+          <w:lang w:val="en-US"/>
+        </w:rPr>
+        <w:t>to</w:t>
+      </w:r>
+      <w:r>
+        <w:rPr>
+          <w:lang w:val="en-US"/>
+        </w:rPr>
+        <w:t xml:space="preserve"> choose the 5 colors. I </w:t>
+      </w:r>
+      <w:r>
+        <w:rPr>
+          <w:lang w:val="en-US"/>
+        </w:rPr>
+        <w:t xml:space="preserve">have always been bad with colors. </w:t>
+      </w:r>
+      <w:r>
+        <w:rPr>
+          <w:lang w:val="en-US"/>
+        </w:rPr>
+        <w:t>Because</w:t>
+      </w:r>
+      <w:r>
+        <w:rPr>
+          <w:lang w:val="en-US"/>
+        </w:rPr>
+        <w:t xml:space="preserve"> I know how important </w:t>
+      </w:r>
+      <w:r>
+        <w:rPr>
+          <w:lang w:val="en-US"/>
+        </w:rPr>
+        <w:t>they</w:t>
+      </w:r>
+      <w:r>
+        <w:rPr>
+          <w:lang w:val="en-US"/>
+        </w:rPr>
+        <w:t xml:space="preserve"> are. They </w:t>
+      </w:r>
+      <w:r>
+        <w:rPr>
+          <w:lang w:val="en-US"/>
+        </w:rPr>
+        <w:t>affect</w:t>
+      </w:r>
+      <w:r>
+        <w:rPr>
+          <w:lang w:val="en-US"/>
+        </w:rPr>
+        <w:t xml:space="preserve"> how people see the site, how you feel. Does it feel trustworthy, safe, good, bad</w:t>
+      </w:r>
+      <w:r>
+        <w:rPr>
+          <w:lang w:val="en-US"/>
+        </w:rPr>
+        <w:t>. The vibe is created from the colors and that makes it a bit scary for me. The learning curve of Fonts and Color se</w:t>
+      </w:r>
+      <w:r>
+        <w:rPr>
+          <w:lang w:val="en-US"/>
+        </w:rPr>
+        <w:t>a</w:t>
+      </w:r>
+      <w:r>
+        <w:rPr>
+          <w:lang w:val="en-US"/>
+        </w:rPr>
+        <w:t xml:space="preserve">m </w:t>
+      </w:r>
+      <w:r>
+        <w:rPr>
+          <w:lang w:val="en-US"/>
+        </w:rPr>
+        <w:t>so</w:t>
+      </w:r>
+      <w:r>
+        <w:rPr>
+          <w:lang w:val="en-US"/>
+        </w:rPr>
+        <w:t xml:space="preserve"> big. And I don’t want </w:t>
+      </w:r>
+      <w:r>
+        <w:rPr>
+          <w:lang w:val="en-US"/>
+        </w:rPr>
+        <w:t>to do</w:t>
+      </w:r>
+      <w:r>
+        <w:rPr>
+          <w:lang w:val="en-US"/>
+        </w:rPr>
+        <w:t xml:space="preserve"> it wrong.</w:t>
+      </w:r>
+      <w:r>
+        <w:rPr>
+          <w:lang w:val="en-US"/>
+        </w:rPr>
+        <w:t xml:space="preserve"> I know that Blue </w:t>
+      </w:r>
+      <w:r>
+        <w:rPr>
+          <w:lang w:val="en-US"/>
+        </w:rPr>
+        <w:t xml:space="preserve">is a color of trust and such. So, I felt like that </w:t>
+      </w:r>
+      <w:r>
+        <w:rPr>
+          <w:lang w:val="en-US"/>
+        </w:rPr>
+        <w:t xml:space="preserve">should </w:t>
+      </w:r>
+      <w:r>
+        <w:rPr>
+          <w:lang w:val="en-US"/>
+        </w:rPr>
+        <w:t xml:space="preserve">be my main color. </w:t>
+      </w:r>
+      <w:r>
+        <w:rPr>
+          <w:lang w:val="en-US"/>
+        </w:rPr>
+        <w:t xml:space="preserve">So, I found a calmer tone of blue and some other colors that work together. </w:t>
+      </w:r>
+      <w:r>
+        <w:rPr>
+          <w:lang w:val="en-US"/>
+        </w:rPr>
+        <w:t xml:space="preserve">I wanted </w:t>
+      </w:r>
+      <w:r>
+        <w:rPr>
+          <w:lang w:val="en-US"/>
+        </w:rPr>
+        <w:t xml:space="preserve">a </w:t>
+      </w:r>
+      <w:r>
+        <w:rPr>
+          <w:lang w:val="en-US"/>
+        </w:rPr>
+        <w:t>purple</w:t>
+      </w:r>
+      <w:r>
+        <w:rPr>
+          <w:lang w:val="en-US"/>
+        </w:rPr>
+        <w:t xml:space="preserve"> color</w:t>
+      </w:r>
+      <w:r>
+        <w:rPr>
+          <w:lang w:val="en-US"/>
+        </w:rPr>
+        <w:t xml:space="preserve"> for</w:t>
+      </w:r>
+      <w:r>
+        <w:rPr>
+          <w:lang w:val="en-US"/>
+        </w:rPr>
+        <w:t xml:space="preserve"> a</w:t>
+      </w:r>
+      <w:r>
+        <w:rPr>
+          <w:lang w:val="en-US"/>
+        </w:rPr>
+        <w:t xml:space="preserve"> </w:t>
+      </w:r>
+      <w:r>
+        <w:rPr>
+          <w:lang w:val="en-US"/>
+        </w:rPr>
+        <w:t>feel</w:t>
+      </w:r>
+      <w:r>
+        <w:rPr>
+          <w:lang w:val="en-US"/>
+        </w:rPr>
+        <w:t xml:space="preserve"> </w:t>
+      </w:r>
+      <w:r>
+        <w:rPr>
+          <w:lang w:val="en-US"/>
+        </w:rPr>
+        <w:t xml:space="preserve">of </w:t>
+      </w:r>
+      <w:r>
+        <w:rPr>
+          <w:lang w:val="en-US"/>
+        </w:rPr>
+        <w:t>luxury.</w:t>
+      </w:r>
+      <w:r>
+        <w:rPr>
+          <w:lang w:val="en-US"/>
+        </w:rPr>
+        <w:t xml:space="preserve"> Then an Orange and Green too complete the palate.</w:t>
+      </w:r>
+    </w:p>
+    <w:p>
+      <w:pPr>
+        <w:rPr>
+          <w:i/>
+          <w:iCs/>
+          <w:lang w:val="en-US"/>
+        </w:rPr>
+      </w:pPr>
+      <w:r>
+        <w:rPr>
+          <w:lang w:val="en-US"/>
+        </w:rPr>
+        <w:t xml:space="preserve">I think il be taking most of the icons from </w:t>
+      </w:r>
+      <w:hyperlink r:id="rId7" w:history="1">
+        <w:proofErr w:type="spellStart"/>
+        <w:r>
+          <w:rPr>
+            <w:rStyle w:val="Hyperkobling"/>
+            <w:i/>
+            <w:iCs/>
+            <w:lang w:val="en-US"/>
+          </w:rPr>
+          <w:t>FontAw</w:t>
+        </w:r>
+        <w:r>
+          <w:rPr>
+            <w:rStyle w:val="Hyperkobling"/>
+            <w:i/>
+            <w:iCs/>
+            <w:lang w:val="en-US"/>
+          </w:rPr>
+          <w:t>e</w:t>
+        </w:r>
+        <w:r>
+          <w:rPr>
+            <w:rStyle w:val="Hyperkobling"/>
+            <w:i/>
+            <w:iCs/>
+            <w:lang w:val="en-US"/>
+          </w:rPr>
+          <w:t>s</w:t>
+        </w:r>
+        <w:r>
+          <w:rPr>
+            <w:rStyle w:val="Hyperkobling"/>
+            <w:i/>
+            <w:iCs/>
+            <w:lang w:val="en-US"/>
+          </w:rPr>
+          <w:t>ome</w:t>
+        </w:r>
+        <w:proofErr w:type="spellEnd"/>
+      </w:hyperlink>
+      <w:r>
+        <w:rPr>
+          <w:lang w:val="en-US"/>
+        </w:rPr>
+        <w:t>.</w:t>
+      </w:r>
+    </w:p>
+    <w:p>
+      <w:pPr>
+        <w:rPr>
+          <w:lang w:val="en-US"/>
+        </w:rPr>
+      </w:pPr>
+    </w:p>
+    <w:p>
+      <w:pPr>
+        <w:pStyle w:val="Overskrift2"/>
+        <w:rPr>
+          <w:lang w:val="en-US"/>
+        </w:rPr>
+      </w:pPr>
+      <w:bookmarkStart w:id="3" w:name="_Toc239229032"/>
+      <w:r>
+        <w:rPr>
+          <w:lang w:val="en-US"/>
+        </w:rPr>
+        <w:lastRenderedPageBreak/>
+        <w:t>Technologies:</w:t>
+      </w:r>
+      <w:bookmarkEnd w:id="3"/>
+    </w:p>
+    <w:p>
+      <w:pPr>
+        <w:rPr>
+          <w:lang w:val="en-US"/>
+        </w:rPr>
+      </w:pPr>
+      <w:r>
+        <w:rPr>
+          <w:lang w:val="en-US"/>
+        </w:rPr>
+        <w:t>ASP.Net MVC Core</w:t>
+      </w:r>
+    </w:p>
+    <w:p>
+      <w:pPr>
+        <w:rPr>
+          <w:lang w:val="en-US"/>
+        </w:rPr>
+      </w:pPr>
+      <w:r>
+        <w:rPr>
+          <w:lang w:val="en-US"/>
+        </w:rPr>
+        <w:t>Figma</w:t>
+      </w:r>
+    </w:p>
+    <w:p>
+      <w:pPr>
+        <w:rPr>
+          <w:lang w:val="en-US"/>
+        </w:rPr>
+      </w:pPr>
+      <w:r>
+        <w:rPr>
+          <w:lang w:val="en-US"/>
+        </w:rPr>
         <w:t>Visual Studio</w:t>
       </w:r>
     </w:p>
     <w:sectPr>
-      <w:headerReference w:type="default" r:id="rId5"/>
+      <w:headerReference w:type="default" r:id="rId8"/>
       <w:pgSz w:w="11906" w:h="16838"/>
       <w:pgMar w:top="1417" w:right="1417" w:bottom="1417" w:left="1417" w:header="708" w:footer="708" w:gutter="0"/>
       <w:cols w:space="708"/>
@@ -300,6 +850,56 @@
     </w:sectPr>
   </w:body>
 </w:document>
+</file>
+
+<file path=word/endnotes.xml><?xml version="1.0" encoding="utf-8"?>
+<w:endnotes xmlns:wpc="http://schemas.microsoft.com/office/word/2010/wordprocessingCanvas" xmlns:cx="http://schemas.microsoft.com/office/drawing/2014/chartex" xmlns:cx1="http://schemas.microsoft.com/office/drawing/2015/9/8/chartex" xmlns:cx2="http://schemas.microsoft.com/office/drawing/2015/10/21/chartex" xmlns:cx3="http://schemas.microsoft.com/office/drawing/2016/5/9/chartex" xmlns:cx4="http://schemas.microsoft.com/office/drawing/2016/5/10/chartex" xmlns:cx5="http://schemas.microsoft.com/office/drawing/2016/5/11/chartex" xmlns:cx6="http://schemas.microsoft.com/office/drawing/2016/5/12/chartex" xmlns:cx7="http://schemas.microsoft.com/office/drawing/2016/5/13/chartex" xmlns:cx8="http://schemas.microsoft.com/office/drawing/2016/5/14/chartex" xmlns:mc="http://schemas.openxmlformats.org/markup-compatibility/2006" xmlns:aink="http://schemas.microsoft.com/office/drawing/2016/ink" xmlns:am3d="http://schemas.microsoft.com/office/drawing/2017/model3d" xmlns:o="urn:schemas-microsoft-com:office:office" xmlns:oel="http://schemas.microsoft.com/office/2019/extlst" xmlns:r="http://schemas.openxmlformats.org/officeDocument/2006/relationships" xmlns:m="http://schemas.openxmlformats.org/officeDocument/2006/math" xmlns:v="urn:schemas-microsoft-com:vml" xmlns:wp14="http://schemas.microsoft.com/office/word/2010/wordprocessingDrawing" xmlns:wp="http://schemas.openxmlformats.org/drawingml/2006/wordprocessingDrawing" xmlns:w10="urn:schemas-microsoft-com:office:word" xmlns:w="http://schemas.openxmlformats.org/wordprocessingml/2006/main" xmlns:w14="http://schemas.microsoft.com/office/word/2010/wordml" xmlns:w15="http://schemas.microsoft.com/office/word/2012/wordml" xmlns:w16cei="http://schemas.microsoft.com/office/word/2026/wordml/cei" xmlns:w16cex="http://schemas.microsoft.com/office/word/2018/wordml/cex" xmlns:w16cid="http://schemas.microsoft.com/office/word/2016/wordml/cid" xmlns:w16="http://schemas.microsoft.com/office/word/2018/wordml" xmlns:w16du="http://schemas.microsoft.com/office/word/2023/wordml/word16du" xmlns:w16sdtdh="http://schemas.microsoft.com/office/word/2020/wordml/sdtdatahash" xmlns:w16sdtfl="http://schemas.microsoft.com/office/word/2024/wordml/sdtformatlock" xmlns:w16se="http://schemas.microsoft.com/office/word/2015/wordml/symex" xmlns:wpg="http://schemas.microsoft.com/office/word/2010/wordprocessingGroup" xmlns:wpi="http://schemas.microsoft.com/office/word/2010/wordprocessingInk" xmlns:wne="http://schemas.microsoft.com/office/word/2006/wordml" xmlns:wps="http://schemas.microsoft.com/office/word/2010/wordprocessingShape" mc:Ignorable="w14 w15 w16se w16cid w16 w16cex w16sdtdh w16sdtfl w16du wp14">
+  <w:endnote w:type="separator" w:id="-1">
+    <w:p>
+      <w:pPr>
+        <w:spacing w:after="0" w:line="240" w:lineRule="auto"/>
+      </w:pPr>
+      <w:r>
+        <w:separator/>
+      </w:r>
+    </w:p>
+  </w:endnote>
+  <w:endnote w:type="continuationSeparator" w:id="0">
+    <w:p>
+      <w:pPr>
+        <w:spacing w:after="0" w:line="240" w:lineRule="auto"/>
+      </w:pPr>
+      <w:r>
+        <w:continuationSeparator/>
+      </w:r>
+    </w:p>
+  </w:endnote>
+</w:endnotes>
+</file>
+
+<file path=word/footnotes.xml><?xml version="1.0" encoding="utf-8"?>
+<w:footnotes xmlns:wpc="http://schemas.microsoft.com/office/word/2010/wordprocessingCanvas" xmlns:cx="http://schemas.microsoft.com/office/drawing/2014/chartex" xmlns:cx1="http://schemas.microsoft.com/office/drawing/2015/9/8/chartex" xmlns:cx2="http://schemas.microsoft.com/office/drawing/2015/10/21/chartex" xmlns:cx3="http://schemas.microsoft.com/office/drawing/2016/5/9/chartex" xmlns:cx4="http://schemas.microsoft.com/office/drawing/2016/5/10/chartex" xmlns:cx5="http://schemas.microsoft.com/office/drawing/2016/5/11/chartex" xmlns:cx6="http://schemas.microsoft.com/office/drawing/2016/5/12/chartex" xmlns:cx7="http://schemas.microsoft.com/office/drawing/2016/5/13/chartex" xmlns:cx8="http://schemas.microsoft.com/office/drawing/2016/5/14/chartex" xmlns:mc="http://schemas.openxmlformats.org/markup-compatibility/2006" xmlns:aink="http://schemas.microsoft.com/office/drawing/2016/ink" xmlns:am3d="http://schemas.microsoft.com/office/drawing/2017/model3d" xmlns:o="urn:schemas-microsoft-com:office:office" xmlns:oel="http://schemas.microsoft.com/office/2019/extlst" xmlns:r="http://schemas.openxmlformats.org/officeDocument/2006/relationships" xmlns:m="http://schemas.openxmlformats.org/officeDocument/2006/math" xmlns:v="urn:schemas-microsoft-com:vml" xmlns:wp14="http://schemas.microsoft.com/office/word/2010/wordprocessingDrawing" xmlns:wp="http://schemas.openxmlformats.org/drawingml/2006/wordprocessingDrawing" xmlns:w10="urn:schemas-microsoft-com:office:word" xmlns:w="http://schemas.openxmlformats.org/wordprocessingml/2006/main" xmlns:w14="http://schemas.microsoft.com/office/word/2010/wordml" xmlns:w15="http://schemas.microsoft.com/office/word/2012/wordml" xmlns:w16cei="http://schemas.microsoft.com/office/word/2026/wordml/cei" xmlns:w16cex="http://schemas.microsoft.com/office/word/2018/wordml/cex" xmlns:w16cid="http://schemas.microsoft.com/office/word/2016/wordml/cid" xmlns:w16="http://schemas.microsoft.com/office/word/2018/wordml" xmlns:w16du="http://schemas.microsoft.com/office/word/2023/wordml/word16du" xmlns:w16sdtdh="http://schemas.microsoft.com/office/word/2020/wordml/sdtdatahash" xmlns:w16sdtfl="http://schemas.microsoft.com/office/word/2024/wordml/sdtformatlock" xmlns:w16se="http://schemas.microsoft.com/office/word/2015/wordml/symex" xmlns:wpg="http://schemas.microsoft.com/office/word/2010/wordprocessingGroup" xmlns:wpi="http://schemas.microsoft.com/office/word/2010/wordprocessingInk" xmlns:wne="http://schemas.microsoft.com/office/word/2006/wordml" xmlns:wps="http://schemas.microsoft.com/office/word/2010/wordprocessingShape" mc:Ignorable="w14 w15 w16se w16cid w16 w16cex w16sdtdh w16sdtfl w16du wp14">
+  <w:footnote w:type="separator" w:id="-1">
+    <w:p>
+      <w:pPr>
+        <w:spacing w:after="0" w:line="240" w:lineRule="auto"/>
+      </w:pPr>
+      <w:r>
+        <w:separator/>
+      </w:r>
+    </w:p>
+  </w:footnote>
+  <w:footnote w:type="continuationSeparator" w:id="0">
+    <w:p>
+      <w:pPr>
+        <w:spacing w:after="0" w:line="240" w:lineRule="auto"/>
+      </w:pPr>
+      <w:r>
+        <w:continuationSeparator/>
+      </w:r>
+    </w:p>
+  </w:footnote>
+</w:footnotes>
 </file>
 
 <file path=word/header1.xml><?xml version="1.0" encoding="utf-8"?>
@@ -312,6 +912,7 @@
         <w:docPartUnique/>
       </w:docPartObj>
     </w:sdtPr>
+    <w:sdtEndPr/>
     <w:sdtContent>
       <w:p>
         <w:pPr>
@@ -1067,6 +1668,7 @@
   <w:style w:type="character" w:default="1" w:styleId="Standardskriftforavsnitt">
     <w:name w:val="Default Paragraph Font"/>
     <w:uiPriority w:val="1"/>
+    <w:semiHidden/>
     <w:unhideWhenUsed/>
   </w:style>
   <w:style w:type="table" w:default="1" w:styleId="Vanligtabell">
@@ -1457,6 +2059,30 @@
       <w:spacing w:after="100"/>
       <w:ind w:left="240"/>
     </w:pPr>
+  </w:style>
+  <w:style w:type="character" w:styleId="Ulstomtale">
+    <w:name w:val="Unresolved Mention"/>
+    <w:basedOn w:val="Standardskriftforavsnitt"/>
+    <w:uiPriority w:val="99"/>
+    <w:semiHidden/>
+    <w:unhideWhenUsed/>
+    <w:rsid w:val="009206D6"/>
+    <w:rPr>
+      <w:color w:val="605E5C"/>
+      <w:shd w:val="clear" w:color="auto" w:fill="E1DFDD"/>
+    </w:rPr>
+  </w:style>
+  <w:style w:type="character" w:styleId="Fulgthyperkobling">
+    <w:name w:val="FollowedHyperlink"/>
+    <w:basedOn w:val="Standardskriftforavsnitt"/>
+    <w:uiPriority w:val="99"/>
+    <w:semiHidden/>
+    <w:unhideWhenUsed/>
+    <w:rsid w:val="009206D6"/>
+    <w:rPr>
+      <w:color w:val="96607D" w:themeColor="followedHyperlink"/>
+      <w:u w:val="single"/>
+    </w:rPr>
   </w:style>
 </w:styles>
 </file>

</xml_diff>